<commit_message>
Manual Figure 15: simplify the firmware workflow to five linear steps
The old schematic had nine boxes, a decision diamond and crossing
branches, all restating text that chapter 18 already gives. It is now a
single row of five numbered steps in the style of Figure 3:
1. stop and save data;
2. check the firmware version;
3. launch the loader;
4. program the verified HEX;
5. reconnect and verify.

A one-line note keeps the two key caveats: a 2.2 reply does not identify
the build, and the application only launches the loader. The version
decision stays in the "2.2 version string is not enough" section.

The SVG is the source; the PNG was rendered from it at about 3000 px
wide. Word, PDF and the local ZIP were regenerated; still 37 pages.

Co-Authored-By: Claude Opus 5.5 <noreply@anthropic.com>
</commit_message>
<xml_diff>
--- a/docs/user-manual/openQCM_Q-1_Software_User_Manual_v3.0.docx
+++ b/docs/user-manual/openQCM_Q-1_Software_User_Manual_v3.0.docx
@@ -1898,7 +1898,7 @@
           <w:noProof/>
         </w:rPr>
         <w:drawing>
-          <wp:inline distT="0" distB="0" distL="0" distR="0" wp14:anchorId="70010BC3" wp14:editId="732D36D7">
+          <wp:inline distT="0" distB="0" distL="0" distR="0">
             <wp:extent cx="6309360" cy="3217774"/>
             <wp:effectExtent l="0" t="0" r="0" b="0"/>
             <wp:docPr id="2" name="Picture 2" descr="Figure 1. Q-1 functional measurement path."/>
@@ -3573,7 +3573,7 @@
           <w:noProof/>
         </w:rPr>
         <w:drawing>
-          <wp:inline distT="0" distB="0" distL="0" distR="0" wp14:anchorId="289DD1D0" wp14:editId="4986EE35">
+          <wp:inline distT="0" distB="0" distL="0" distR="0">
             <wp:extent cx="1549908" cy="918972"/>
             <wp:effectExtent l="0" t="0" r="0" b="0"/>
             <wp:docPr id="3" name="Picture 3" descr="Figure 2. Serial Connection group."/>
@@ -3859,7 +3859,7 @@
           <w:noProof/>
         </w:rPr>
         <w:drawing>
-          <wp:inline distT="0" distB="0" distL="0" distR="0" wp14:anchorId="586D3255" wp14:editId="7030C0DD">
+          <wp:inline distT="0" distB="0" distL="0" distR="0">
             <wp:extent cx="6309360" cy="744504"/>
             <wp:effectExtent l="0" t="0" r="0" b="0"/>
             <wp:docPr id="4" name="Picture 4" descr="Figure 3. Operating sequence."/>
@@ -4201,7 +4201,7 @@
           <w:noProof/>
         </w:rPr>
         <w:drawing>
-          <wp:inline distT="0" distB="0" distL="0" distR="0" wp14:anchorId="1963E442" wp14:editId="28388920">
+          <wp:inline distT="0" distB="0" distL="0" distR="0">
             <wp:extent cx="6346190" cy="4759642"/>
             <wp:effectExtent l="0" t="0" r="0" b="0"/>
             <wp:docPr id="5" name="Picture 5" descr="Figure 4. Main window during a Measurement run."/>
@@ -4321,7 +4321,7 @@
           <w:noProof/>
         </w:rPr>
         <w:drawing>
-          <wp:inline distT="0" distB="0" distL="0" distR="0" wp14:anchorId="1BF15F9A" wp14:editId="15ED5BA8">
+          <wp:inline distT="0" distB="0" distL="0" distR="0">
             <wp:extent cx="4347140" cy="1344599"/>
             <wp:effectExtent l="0" t="0" r="0" b="0"/>
             <wp:docPr id="6" name="Picture 6" descr="Figure 5. Menus."/>
@@ -4476,7 +4476,7 @@
           <w:noProof/>
         </w:rPr>
         <w:drawing>
-          <wp:inline distT="0" distB="0" distL="0" distR="0" wp14:anchorId="4DE20529" wp14:editId="72ECDA85">
+          <wp:inline distT="0" distB="0" distL="0" distR="0">
             <wp:extent cx="3433572" cy="1485900"/>
             <wp:effectExtent l="0" t="0" r="0" b="0"/>
             <wp:docPr id="7" name="Picture 7" descr="Figure 6. Measurement Setup in both modes."/>
@@ -5136,7 +5136,7 @@
           <w:noProof/>
         </w:rPr>
         <w:drawing>
-          <wp:inline distT="0" distB="0" distL="0" distR="0" wp14:anchorId="03881E5A" wp14:editId="180103E4">
+          <wp:inline distT="0" distB="0" distL="0" distR="0">
             <wp:extent cx="5552916" cy="3966369"/>
             <wp:effectExtent l="0" t="0" r="0" b="0"/>
             <wp:docPr id="8" name="Picture 8" descr="Figure 7. Peak Data View."/>
@@ -6079,7 +6079,7 @@
           <w:noProof/>
         </w:rPr>
         <w:drawing>
-          <wp:inline distT="0" distB="0" distL="0" distR="0" wp14:anchorId="79FF0735" wp14:editId="47C48419">
+          <wp:inline distT="0" distB="0" distL="0" distR="0">
             <wp:extent cx="713232" cy="1083565"/>
             <wp:effectExtent l="0" t="0" r="0" b="0"/>
             <wp:docPr id="9" name="Picture 9" descr="Figure 8. Plot context menu."/>
@@ -6217,7 +6217,7 @@
           <w:noProof/>
         </w:rPr>
         <w:drawing>
-          <wp:inline distT="0" distB="0" distL="0" distR="0" wp14:anchorId="590C990F" wp14:editId="5358B674">
+          <wp:inline distT="0" distB="0" distL="0" distR="0">
             <wp:extent cx="4969860" cy="4255914"/>
             <wp:effectExtent l="0" t="0" r="0" b="0"/>
             <wp:docPr id="10" name="Picture 10" descr="Figure 9. Plots tab during a Measurement run."/>
@@ -6304,7 +6304,7 @@
           <w:noProof/>
         </w:rPr>
         <w:drawing>
-          <wp:inline distT="0" distB="0" distL="0" distR="0" wp14:anchorId="0D5C7076" wp14:editId="2E531D0F">
+          <wp:inline distT="0" distB="0" distL="0" distR="0">
             <wp:extent cx="1760220" cy="1952244"/>
             <wp:effectExtent l="0" t="0" r="0" b="0"/>
             <wp:docPr id="11" name="Picture 11" descr="Figure 10. Measurement Parameters."/>
@@ -6381,7 +6381,7 @@
           <w:noProof/>
         </w:rPr>
         <w:drawing>
-          <wp:inline distT="0" distB="0" distL="0" distR="0" wp14:anchorId="458E9926" wp14:editId="0A961256">
+          <wp:inline distT="0" distB="0" distL="0" distR="0">
             <wp:extent cx="5552916" cy="3966369"/>
             <wp:effectExtent l="0" t="0" r="0" b="0"/>
             <wp:docPr id="12" name="Picture 12" descr="Figure 11. Raw Data View."/>
@@ -6612,7 +6612,7 @@
           <w:noProof/>
         </w:rPr>
         <w:drawing>
-          <wp:inline distT="0" distB="0" distL="0" distR="0" wp14:anchorId="3A4A2451" wp14:editId="495FFE4F">
+          <wp:inline distT="0" distB="0" distL="0" distR="0">
             <wp:extent cx="5552916" cy="3966369"/>
             <wp:effectExtent l="0" t="0" r="0" b="0"/>
             <wp:docPr id="13" name="Picture 13" descr="Figure 12. Data View of a recorded CSV."/>
@@ -6767,7 +6767,7 @@
           <w:noProof/>
         </w:rPr>
         <w:drawing>
-          <wp:inline distT="0" distB="0" distL="0" distR="0" wp14:anchorId="02ABF019" wp14:editId="1926A8EE">
+          <wp:inline distT="0" distB="0" distL="0" distR="0">
             <wp:extent cx="4823104" cy="2740761"/>
             <wp:effectExtent l="0" t="0" r="0" b="0"/>
             <wp:docPr id="14" name="Picture 14" descr="Figure 13. Live cursors."/>
@@ -6921,7 +6921,7 @@
           <w:noProof/>
         </w:rPr>
         <w:drawing>
-          <wp:inline distT="0" distB="0" distL="0" distR="0" wp14:anchorId="7B2B6EA1" wp14:editId="4C4001DC">
+          <wp:inline distT="0" distB="0" distL="0" distR="0">
             <wp:extent cx="6346190" cy="940176"/>
             <wp:effectExtent l="0" t="0" r="0" b="0"/>
             <wp:docPr id="15" name="Picture 15" descr="Figure 14. Status bar states."/>
@@ -9562,8 +9562,8 @@
           <w:noProof/>
         </w:rPr>
         <w:drawing>
-          <wp:inline distT="0" distB="0" distL="0" distR="0" wp14:anchorId="4E943A00" wp14:editId="2781ED1D">
-            <wp:extent cx="6309360" cy="3280867"/>
+          <wp:inline distT="0" distB="0" distL="0" distR="0">
+            <wp:extent cx="6309360" cy="1069630"/>
             <wp:effectExtent l="0" t="0" r="0" b="0"/>
             <wp:docPr id="16" name="Picture 16" descr="Figure 15. Firmware update workflow."/>
             <wp:cNvGraphicFramePr>
@@ -9573,7 +9573,7 @@
               <a:graphicData uri="http://schemas.openxmlformats.org/drawingml/2006/picture">
                 <pic:pic xmlns:pic="http://schemas.openxmlformats.org/drawingml/2006/picture">
                   <pic:nvPicPr>
-                    <pic:cNvPr id="0" name="image.png"/>
+                    <pic:cNvPr id="0" name="firmware_workflow.png"/>
                     <pic:cNvPicPr/>
                   </pic:nvPicPr>
                   <pic:blipFill>
@@ -9585,7 +9585,7 @@
                   <pic:spPr>
                     <a:xfrm>
                       <a:off x="0" y="0"/>
-                      <a:ext cx="6309360" cy="3280867"/>
+                      <a:ext cx="6309360" cy="1069630"/>
                     </a:xfrm>
                     <a:prstGeom prst="rect">
                       <a:avLst/>

</xml_diff>